<commit_message>
changes done in docx file
</commit_message>
<xml_diff>
--- a/SearchX_Design_Doc.docx
+++ b/SearchX_Design_Doc.docx
@@ -122,7 +122,7 @@
                 <w:sz w:val="18"/>
                 <w:szCs w:val="18"/>
               </w:rPr>
-              <w:t xml:space="preserve">Author: Pandi</w:t>
+              <w:t xml:space="preserve">Author: Pandiaraj</w:t>
             </w:r>
           </w:p>
         </w:tc>
@@ -4967,7 +4967,7 @@
           <w:sz w:val="17"/>
           <w:szCs w:val="17"/>
         </w:rPr>
-        <w:t xml:space="preserve">Built by Pandi  •  March 2026  •  github.com/Pandiaraj-1/distributed-search-engine</w:t>
+        <w:t xml:space="preserve">Built by Pandiaraj  •  March 2026  •  github.com/Pandiarajaraj-1/distributed-search-engine</w:t>
       </w:r>
     </w:p>
     <w:sectPr>
@@ -5089,7 +5089,7 @@
         <w:sz w:val="16"/>
         <w:szCs w:val="16"/>
       </w:rPr>
-      <w:t xml:space="preserve">     |     Author: Pandi     |     Version: 1.0     |     March 2026</w:t>
+      <w:t xml:space="preserve">     |     Author: Pandiaraj     |     Version: 1.0     |     March 2026</w:t>
     </w:r>
   </w:p>
 </w:hdr>

</xml_diff>